<commit_message>
changement aussi pour le template expert comptable sans retard
</commit_message>
<xml_diff>
--- a/app/public/templates/Expert-comptable-sans-retard.docx
+++ b/app/public/templates/Expert-comptable-sans-retard.docx
@@ -386,7 +386,23 @@
         <w:rPr>
           <w:rFonts w:ascii="Arial" w:hAnsi="Arial" w:cs="Arial"/>
         </w:rPr>
-        <w:t>{raisonSociale}</w:t>
+        <w:t>{</w:t>
+      </w:r>
+      <w:proofErr w:type="spellStart"/>
+      <w:proofErr w:type="gramStart"/>
+      <w:r>
+        <w:rPr>
+          <w:rFonts w:ascii="Arial" w:hAnsi="Arial" w:cs="Arial"/>
+        </w:rPr>
+        <w:t>raisonSociale</w:t>
+      </w:r>
+      <w:proofErr w:type="spellEnd"/>
+      <w:proofErr w:type="gramEnd"/>
+      <w:r>
+        <w:rPr>
+          <w:rFonts w:ascii="Arial" w:hAnsi="Arial" w:cs="Arial"/>
+        </w:rPr>
+        <w:t>}</w:t>
       </w:r>
     </w:p>
     <w:p>
@@ -451,8 +467,9 @@
           <w:sz w:val="22"/>
           <w:szCs w:val="22"/>
         </w:rPr>
-        <w:t>{jourDebut}</w:t>
-      </w:r>
+        <w:t>{</w:t>
+      </w:r>
+      <w:proofErr w:type="spellStart"/>
       <w:r>
         <w:rPr>
           <w:rFonts w:ascii="Arial" w:hAnsi="Arial" w:cs="Arial"/>
@@ -460,10 +477,32 @@
           <w:bCs/>
           <w:sz w:val="22"/>
           <w:szCs w:val="22"/>
+        </w:rPr>
+        <w:t>jourDebut</w:t>
+      </w:r>
+      <w:proofErr w:type="spellEnd"/>
+      <w:r>
+        <w:rPr>
+          <w:rFonts w:ascii="Arial" w:hAnsi="Arial" w:cs="Arial"/>
+          <w:b/>
+          <w:bCs/>
+          <w:sz w:val="22"/>
+          <w:szCs w:val="22"/>
+        </w:rPr>
+        <w:t>}</w:t>
+      </w:r>
+      <w:r>
+        <w:rPr>
+          <w:rFonts w:ascii="Arial" w:hAnsi="Arial" w:cs="Arial"/>
+          <w:b/>
+          <w:bCs/>
+          <w:sz w:val="22"/>
+          <w:szCs w:val="22"/>
           <w:vertAlign w:val="superscript"/>
         </w:rPr>
-        <w:t>{exposantDebut}</w:t>
-      </w:r>
+        <w:t>{</w:t>
+      </w:r>
+      <w:proofErr w:type="spellStart"/>
       <w:r>
         <w:rPr>
           <w:rFonts w:ascii="Arial" w:hAnsi="Arial" w:cs="Arial"/>
@@ -471,8 +510,53 @@
           <w:bCs/>
           <w:sz w:val="22"/>
           <w:szCs w:val="22"/>
-        </w:rPr>
-        <w:t>{finCouverture}</w:t>
+          <w:vertAlign w:val="superscript"/>
+        </w:rPr>
+        <w:t>exposantDebut</w:t>
+      </w:r>
+      <w:proofErr w:type="spellEnd"/>
+      <w:r>
+        <w:rPr>
+          <w:rFonts w:ascii="Arial" w:hAnsi="Arial" w:cs="Arial"/>
+          <w:b/>
+          <w:bCs/>
+          <w:sz w:val="22"/>
+          <w:szCs w:val="22"/>
+          <w:vertAlign w:val="superscript"/>
+        </w:rPr>
+        <w:t>}</w:t>
+      </w:r>
+      <w:r>
+        <w:rPr>
+          <w:rFonts w:ascii="Arial" w:hAnsi="Arial" w:cs="Arial"/>
+          <w:b/>
+          <w:bCs/>
+          <w:sz w:val="22"/>
+          <w:szCs w:val="22"/>
+        </w:rPr>
+        <w:t>{</w:t>
+      </w:r>
+      <w:proofErr w:type="spellStart"/>
+      <w:r>
+        <w:rPr>
+          <w:rFonts w:ascii="Arial" w:hAnsi="Arial" w:cs="Arial"/>
+          <w:b/>
+          <w:bCs/>
+          <w:sz w:val="22"/>
+          <w:szCs w:val="22"/>
+        </w:rPr>
+        <w:t>finCouverture</w:t>
+      </w:r>
+      <w:proofErr w:type="spellEnd"/>
+      <w:r>
+        <w:rPr>
+          <w:rFonts w:ascii="Arial" w:hAnsi="Arial" w:cs="Arial"/>
+          <w:b/>
+          <w:bCs/>
+          <w:sz w:val="22"/>
+          <w:szCs w:val="22"/>
+        </w:rPr>
+        <w:t>}</w:t>
       </w:r>
     </w:p>
     <w:p>
@@ -902,7 +986,7 @@
           <w:sz w:val="22"/>
           <w:szCs w:val="22"/>
         </w:rPr>
-        <w:t>A l’aimable attention de</w:t>
+        <w:t>A l’attention de</w:t>
       </w:r>
       <w:r>
         <w:rPr>
@@ -922,7 +1006,51 @@
           <w:sz w:val="22"/>
           <w:szCs w:val="22"/>
         </w:rPr>
-        <w:t>{civilite} {representant}</w:t>
+        <w:t>{</w:t>
+      </w:r>
+      <w:proofErr w:type="spellStart"/>
+      <w:r>
+        <w:rPr>
+          <w:rFonts w:ascii="Arial" w:hAnsi="Arial" w:cs="Arial"/>
+          <w:b/>
+          <w:bCs/>
+          <w:sz w:val="22"/>
+          <w:szCs w:val="22"/>
+        </w:rPr>
+        <w:t>civilite</w:t>
+      </w:r>
+      <w:proofErr w:type="spellEnd"/>
+      <w:r>
+        <w:rPr>
+          <w:rFonts w:ascii="Arial" w:hAnsi="Arial" w:cs="Arial"/>
+          <w:b/>
+          <w:bCs/>
+          <w:sz w:val="22"/>
+          <w:szCs w:val="22"/>
+        </w:rPr>
+        <w:t>} {</w:t>
+      </w:r>
+      <w:proofErr w:type="spellStart"/>
+      <w:r>
+        <w:rPr>
+          <w:rFonts w:ascii="Arial" w:hAnsi="Arial" w:cs="Arial"/>
+          <w:b/>
+          <w:bCs/>
+          <w:sz w:val="22"/>
+          <w:szCs w:val="22"/>
+        </w:rPr>
+        <w:t>representant</w:t>
+      </w:r>
+      <w:proofErr w:type="spellEnd"/>
+      <w:r>
+        <w:rPr>
+          <w:rFonts w:ascii="Arial" w:hAnsi="Arial" w:cs="Arial"/>
+          <w:b/>
+          <w:bCs/>
+          <w:sz w:val="22"/>
+          <w:szCs w:val="22"/>
+        </w:rPr>
+        <w:t>}</w:t>
       </w:r>
     </w:p>
     <w:p>
@@ -946,7 +1074,53 @@
           <w:sz w:val="22"/>
           <w:szCs w:val="22"/>
         </w:rPr>
-        <w:t>{titreRepresentant} {raisonSociale}</w:t>
+        <w:t>{</w:t>
+      </w:r>
+      <w:proofErr w:type="spellStart"/>
+      <w:proofErr w:type="gramStart"/>
+      <w:r>
+        <w:rPr>
+          <w:rFonts w:ascii="Arial" w:hAnsi="Arial" w:cs="Arial"/>
+          <w:b/>
+          <w:bCs/>
+          <w:sz w:val="22"/>
+          <w:szCs w:val="22"/>
+        </w:rPr>
+        <w:t>titreRepresentant</w:t>
+      </w:r>
+      <w:proofErr w:type="spellEnd"/>
+      <w:proofErr w:type="gramEnd"/>
+      <w:r>
+        <w:rPr>
+          <w:rFonts w:ascii="Arial" w:hAnsi="Arial" w:cs="Arial"/>
+          <w:b/>
+          <w:bCs/>
+          <w:sz w:val="22"/>
+          <w:szCs w:val="22"/>
+        </w:rPr>
+        <w:t>} {</w:t>
+      </w:r>
+      <w:proofErr w:type="spellStart"/>
+      <w:r>
+        <w:rPr>
+          <w:rFonts w:ascii="Arial" w:hAnsi="Arial" w:cs="Arial"/>
+          <w:b/>
+          <w:bCs/>
+          <w:sz w:val="22"/>
+          <w:szCs w:val="22"/>
+        </w:rPr>
+        <w:t>raisonSociale</w:t>
+      </w:r>
+      <w:proofErr w:type="spellEnd"/>
+      <w:r>
+        <w:rPr>
+          <w:rFonts w:ascii="Arial" w:hAnsi="Arial" w:cs="Arial"/>
+          <w:b/>
+          <w:bCs/>
+          <w:sz w:val="22"/>
+          <w:szCs w:val="22"/>
+        </w:rPr>
+        <w:t>}</w:t>
       </w:r>
     </w:p>
     <w:p>
@@ -966,7 +1140,25 @@
           <w:sz w:val="22"/>
           <w:szCs w:val="22"/>
         </w:rPr>
-        <w:t>{adresse}</w:t>
+        <w:t>{</w:t>
+      </w:r>
+      <w:proofErr w:type="gramStart"/>
+      <w:r>
+        <w:rPr>
+          <w:rFonts w:ascii="Arial" w:hAnsi="Arial" w:cs="Arial"/>
+          <w:sz w:val="22"/>
+          <w:szCs w:val="22"/>
+        </w:rPr>
+        <w:t>adresse</w:t>
+      </w:r>
+      <w:proofErr w:type="gramEnd"/>
+      <w:r>
+        <w:rPr>
+          <w:rFonts w:ascii="Arial" w:hAnsi="Arial" w:cs="Arial"/>
+          <w:sz w:val="22"/>
+          <w:szCs w:val="22"/>
+        </w:rPr>
+        <w:t>}</w:t>
       </w:r>
     </w:p>
     <w:p>
@@ -1037,14 +1229,34 @@
           <w:szCs w:val="24"/>
         </w:rPr>
       </w:pPr>
-      <w:r>
-        <w:rPr>
-          <w:rFonts w:ascii="Aptos" w:hAnsi="Aptos" w:cs="Arial"/>
-          <w:b/>
-          <w:sz w:val="24"/>
-          <w:szCs w:val="24"/>
-        </w:rPr>
-        <w:t>délais de paiement modifiant les dispositions de la loi 15-95 relative au code de commerce</w:t>
+      <w:proofErr w:type="gramStart"/>
+      <w:r>
+        <w:rPr>
+          <w:rFonts w:ascii="Aptos" w:hAnsi="Aptos" w:cs="Arial"/>
+          <w:b/>
+          <w:sz w:val="24"/>
+          <w:szCs w:val="24"/>
+        </w:rPr>
+        <w:t>délais</w:t>
+      </w:r>
+      <w:proofErr w:type="gramEnd"/>
+      <w:r>
+        <w:rPr>
+          <w:rFonts w:ascii="Aptos" w:hAnsi="Aptos" w:cs="Arial"/>
+          <w:b/>
+          <w:sz w:val="24"/>
+          <w:szCs w:val="24"/>
+        </w:rPr>
+        <w:t xml:space="preserve"> de paiement modifiant les dispositions de la loi 15-95 relative au code de commerce</w:t>
+      </w:r>
+      <w:r>
+        <w:rPr>
+          <w:rFonts w:ascii="Aptos" w:hAnsi="Aptos" w:cs="Arial"/>
+          <w:b/>
+          <w:sz w:val="24"/>
+          <w:szCs w:val="24"/>
+        </w:rPr>
+        <w:t>.</w:t>
       </w:r>
     </w:p>
     <w:p>
@@ -1104,7 +1316,29 @@
           <w:sz w:val="24"/>
           <w:szCs w:val="24"/>
         </w:rPr>
-        <w:t>{periodeCourte}</w:t>
+        <w:t>{</w:t>
+      </w:r>
+      <w:proofErr w:type="spellStart"/>
+      <w:r>
+        <w:rPr>
+          <w:rFonts w:ascii="Aptos" w:hAnsi="Aptos"/>
+          <w:b/>
+          <w:bCs/>
+          <w:sz w:val="24"/>
+          <w:szCs w:val="24"/>
+        </w:rPr>
+        <w:t>periodeCourte</w:t>
+      </w:r>
+      <w:proofErr w:type="spellEnd"/>
+      <w:r>
+        <w:rPr>
+          <w:rFonts w:ascii="Aptos" w:hAnsi="Aptos"/>
+          <w:b/>
+          <w:bCs/>
+          <w:sz w:val="24"/>
+          <w:szCs w:val="24"/>
+        </w:rPr>
+        <w:t>}</w:t>
       </w:r>
     </w:p>
     <w:p>
@@ -1159,7 +1393,29 @@
           <w:sz w:val="24"/>
           <w:szCs w:val="24"/>
         </w:rPr>
-        <w:t>{raisonSociale}</w:t>
+        <w:t>{</w:t>
+      </w:r>
+      <w:proofErr w:type="spellStart"/>
+      <w:r>
+        <w:rPr>
+          <w:rFonts w:ascii="Aptos" w:hAnsi="Aptos"/>
+          <w:b/>
+          <w:bCs/>
+          <w:sz w:val="24"/>
+          <w:szCs w:val="24"/>
+        </w:rPr>
+        <w:t>raisonSociale</w:t>
+      </w:r>
+      <w:proofErr w:type="spellEnd"/>
+      <w:r>
+        <w:rPr>
+          <w:rFonts w:ascii="Aptos" w:hAnsi="Aptos"/>
+          <w:b/>
+          <w:bCs/>
+          <w:sz w:val="24"/>
+          <w:szCs w:val="24"/>
+        </w:rPr>
+        <w:t>}</w:t>
       </w:r>
       <w:r>
         <w:rPr>
@@ -1177,7 +1433,29 @@
           <w:sz w:val="24"/>
           <w:szCs w:val="24"/>
         </w:rPr>
-        <w:t>{periodeCourte}</w:t>
+        <w:t>{</w:t>
+      </w:r>
+      <w:proofErr w:type="spellStart"/>
+      <w:r>
+        <w:rPr>
+          <w:rFonts w:ascii="Aptos" w:hAnsi="Aptos"/>
+          <w:b/>
+          <w:bCs/>
+          <w:sz w:val="24"/>
+          <w:szCs w:val="24"/>
+        </w:rPr>
+        <w:t>periodeCourte</w:t>
+      </w:r>
+      <w:proofErr w:type="spellEnd"/>
+      <w:r>
+        <w:rPr>
+          <w:rFonts w:ascii="Aptos" w:hAnsi="Aptos"/>
+          <w:b/>
+          <w:bCs/>
+          <w:sz w:val="24"/>
+          <w:szCs w:val="24"/>
+        </w:rPr>
+        <w:t>}</w:t>
       </w:r>
       <w:r>
         <w:rPr>
@@ -1248,7 +1526,29 @@
           <w:sz w:val="24"/>
           <w:szCs w:val="24"/>
         </w:rPr>
-        <w:t>{raisonSociale}</w:t>
+        <w:t>{</w:t>
+      </w:r>
+      <w:proofErr w:type="spellStart"/>
+      <w:r>
+        <w:rPr>
+          <w:rFonts w:ascii="Aptos" w:hAnsi="Aptos"/>
+          <w:b/>
+          <w:bCs/>
+          <w:sz w:val="24"/>
+          <w:szCs w:val="24"/>
+        </w:rPr>
+        <w:t>raisonSociale</w:t>
+      </w:r>
+      <w:proofErr w:type="spellEnd"/>
+      <w:r>
+        <w:rPr>
+          <w:rFonts w:ascii="Aptos" w:hAnsi="Aptos"/>
+          <w:b/>
+          <w:bCs/>
+          <w:sz w:val="24"/>
+          <w:szCs w:val="24"/>
+        </w:rPr>
+        <w:t>}</w:t>
       </w:r>
       <w:r>
         <w:rPr>
@@ -1288,7 +1588,7 @@
           <w:sz w:val="24"/>
           <w:szCs w:val="24"/>
         </w:rPr>
-        <w:t>exhaustivité et de sincérité.</w:t>
+        <w:t>exhaustivité et sincérité.</w:t>
       </w:r>
     </w:p>
     <w:p>
@@ -1437,8 +1737,9 @@
           <w:u w:val="single"/>
           <w:lang w:eastAsia="fr-FR"/>
         </w:rPr>
-        <w:t>{lieu}</w:t>
-      </w:r>
+        <w:t>{</w:t>
+      </w:r>
+      <w:proofErr w:type="gramStart"/>
       <w:r>
         <w:rPr>
           <w:rFonts w:ascii="Aptos" w:hAnsi="Aptos" w:cs="Arial"/>
@@ -1448,8 +1749,9 @@
           <w:u w:val="single"/>
           <w:lang w:eastAsia="fr-FR"/>
         </w:rPr>
-        <w:t xml:space="preserve">, le </w:t>
-      </w:r>
+        <w:t>lieu</w:t>
+      </w:r>
+      <w:proofErr w:type="gramEnd"/>
       <w:r>
         <w:rPr>
           <w:rFonts w:ascii="Aptos" w:hAnsi="Aptos" w:cs="Arial"/>
@@ -1459,7 +1761,53 @@
           <w:u w:val="single"/>
           <w:lang w:eastAsia="fr-FR"/>
         </w:rPr>
-        <w:t>{dateSignature}</w:t>
+        <w:t>}</w:t>
+      </w:r>
+      <w:r>
+        <w:rPr>
+          <w:rFonts w:ascii="Aptos" w:hAnsi="Aptos" w:cs="Arial"/>
+          <w:kern w:val="2"/>
+          <w:sz w:val="24"/>
+          <w:szCs w:val="24"/>
+          <w:u w:val="single"/>
+          <w:lang w:eastAsia="fr-FR"/>
+        </w:rPr>
+        <w:t xml:space="preserve">, le </w:t>
+      </w:r>
+      <w:r>
+        <w:rPr>
+          <w:rFonts w:ascii="Aptos" w:hAnsi="Aptos" w:cs="Arial"/>
+          <w:kern w:val="2"/>
+          <w:sz w:val="24"/>
+          <w:szCs w:val="24"/>
+          <w:u w:val="single"/>
+          <w:lang w:eastAsia="fr-FR"/>
+        </w:rPr>
+        <w:t>{</w:t>
+      </w:r>
+      <w:proofErr w:type="spellStart"/>
+      <w:r>
+        <w:rPr>
+          <w:rFonts w:ascii="Aptos" w:hAnsi="Aptos" w:cs="Arial"/>
+          <w:kern w:val="2"/>
+          <w:sz w:val="24"/>
+          <w:szCs w:val="24"/>
+          <w:u w:val="single"/>
+          <w:lang w:eastAsia="fr-FR"/>
+        </w:rPr>
+        <w:t>dateSignature</w:t>
+      </w:r>
+      <w:proofErr w:type="spellEnd"/>
+      <w:r>
+        <w:rPr>
+          <w:rFonts w:ascii="Aptos" w:hAnsi="Aptos" w:cs="Arial"/>
+          <w:kern w:val="2"/>
+          <w:sz w:val="24"/>
+          <w:szCs w:val="24"/>
+          <w:u w:val="single"/>
+          <w:lang w:eastAsia="fr-FR"/>
+        </w:rPr>
+        <w:t>}</w:t>
       </w:r>
     </w:p>
     <w:p>
@@ -1618,7 +1966,29 @@
           <w:szCs w:val="22"/>
           <w:lang w:val="en-GB"/>
         </w:rPr>
-        <w:t>{signataire}</w:t>
+        <w:t>{</w:t>
+      </w:r>
+      <w:proofErr w:type="spellStart"/>
+      <w:r>
+        <w:rPr>
+          <w:rFonts w:ascii="Calibri" w:hAnsi="Calibri" w:cs="Calibri"/>
+          <w:b/>
+          <w:iCs/>
+          <w:szCs w:val="22"/>
+          <w:lang w:val="en-GB"/>
+        </w:rPr>
+        <w:t>signataire</w:t>
+      </w:r>
+      <w:proofErr w:type="spellEnd"/>
+      <w:r>
+        <w:rPr>
+          <w:rFonts w:ascii="Calibri" w:hAnsi="Calibri" w:cs="Calibri"/>
+          <w:b/>
+          <w:iCs/>
+          <w:szCs w:val="22"/>
+          <w:lang w:val="en-GB"/>
+        </w:rPr>
+        <w:t>}</w:t>
       </w:r>
     </w:p>
     <w:p>
@@ -1638,6 +2008,7 @@
           <w:lang w:val="en-GB"/>
         </w:rPr>
       </w:pPr>
+      <w:proofErr w:type="spellStart"/>
       <w:r>
         <w:rPr>
           <w:rFonts w:ascii="Calibri" w:hAnsi="Calibri" w:cs="Calibri"/>
@@ -1648,6 +2019,7 @@
         </w:rPr>
         <w:t>Associé</w:t>
       </w:r>
+      <w:proofErr w:type="spellEnd"/>
     </w:p>
     <w:p>
       <w:pPr>
@@ -2973,37 +3345,37 @@
       </w:rPr>
     </w:lvl>
   </w:abstractNum>
-  <w:num w:numId="1" w16cid:durableId="366374245">
+  <w:num w:numId="1" w16cid:durableId="701516368">
     <w:abstractNumId w:val="5"/>
   </w:num>
-  <w:num w:numId="2" w16cid:durableId="487019278">
+  <w:num w:numId="2" w16cid:durableId="909729300">
     <w:abstractNumId w:val="3"/>
   </w:num>
-  <w:num w:numId="3" w16cid:durableId="413551342">
+  <w:num w:numId="3" w16cid:durableId="1923760291">
     <w:abstractNumId w:val="6"/>
   </w:num>
-  <w:num w:numId="4" w16cid:durableId="1582444999">
+  <w:num w:numId="4" w16cid:durableId="1564753355">
     <w:abstractNumId w:val="9"/>
   </w:num>
-  <w:num w:numId="5" w16cid:durableId="1812600369">
+  <w:num w:numId="5" w16cid:durableId="1326712770">
     <w:abstractNumId w:val="10"/>
   </w:num>
-  <w:num w:numId="6" w16cid:durableId="2065834600">
+  <w:num w:numId="6" w16cid:durableId="1568035972">
     <w:abstractNumId w:val="0"/>
   </w:num>
-  <w:num w:numId="7" w16cid:durableId="930508048">
+  <w:num w:numId="7" w16cid:durableId="144246567">
     <w:abstractNumId w:val="2"/>
   </w:num>
-  <w:num w:numId="8" w16cid:durableId="1277057370">
+  <w:num w:numId="8" w16cid:durableId="156696988">
     <w:abstractNumId w:val="1"/>
   </w:num>
-  <w:num w:numId="9" w16cid:durableId="217939058">
+  <w:num w:numId="9" w16cid:durableId="1891648695">
     <w:abstractNumId w:val="7"/>
   </w:num>
-  <w:num w:numId="10" w16cid:durableId="80639916">
+  <w:num w:numId="10" w16cid:durableId="1918973952">
     <w:abstractNumId w:val="8"/>
   </w:num>
-  <w:num w:numId="11" w16cid:durableId="1180388662">
+  <w:num w:numId="11" w16cid:durableId="610286531">
     <w:abstractNumId w:val="4"/>
   </w:num>
 </w:numbering>

</xml_diff>